<commit_message>
Add 6th contribution (empirical calibration) to Japanese paper introduction
Matches English paper's 6 contributions - was missing the Polimeter/Thomson
empirical calibration contribution in the JA version.

Co-Authored-By: Tatsuki Onishi <bougtoir@gmail.com>
</commit_message>
<xml_diff>
--- a/tasuki-electoral-model/output/docx/TATSUKI_Electoral_Studies_Japanese.docx
+++ b/tasuki-electoral-model/output/docx/TATSUKI_Electoral_Studies_Japanese.docx
@@ -141,6 +141,11 @@
     <w:p>
       <w:r>
         <w:t>5. TATSUKIと既存の選挙制度改革提案との体系的比較を行い、理論的位置づけを確立する。</w:t>
+      </w:r>
+    </w:p>
+    <w:p>
+      <w:r>
+        <w:t>6. Polimeterプロジェクト（Pétry &amp; Birch, 2019）および比較政党公約データベース（Thomson et al., 2017）の実証的公約実現データを用いてモデルを較正し、TATSUKIの実世界の政治的帰結に対する予測効果を示す反事実分析を実施する。</w:t>
       </w:r>
     </w:p>
     <w:p>

</xml_diff>